<commit_message>
feat: prepare public production source and optimize publication queries
</commit_message>
<xml_diff>
--- a/apps/web/public/documents/yarenler-kurumsal-katilim-protokolu.docx
+++ b/apps/web/public/documents/yarenler-kurumsal-katilim-protokolu.docx
@@ -39,7 +39,7 @@
         <w:widowControl/>
       </w:pPr>
       <w:r>
-        <w:t>1.2 Yarenler proje sahibi: Örnek temsilci. İletişim ve başvuru kanalı: https://yarenler.org/tr/kurumsal-katilim. Tebligat adresi: [İmza öncesinde doldurulacak adres]. KEP adresi varsa: [Adres]. Yarenler, yarenler.org alan adında sunulan bağımsız bir akademik keşif platformudur. Bu protokoldeki proje sahibi sıfatı, Ankara Yıldırım Beyazıt Üniversitesini temsil etme yetkisi veya üniversite adına sözleşme kurulması anlamına gelmez. Bundan sonra “Proje Sahibi” olarak anılır.</w:t>
+        <w:t>1.2 Yarenler proje sahibi: Tarık İsmet Alkan. İletişim ve başvuru kanalı: https://yarenler.org/tr/kurumsal-katilim. Tebligat adresi: [İmza öncesinde doldurulacak adres]. KEP adresi varsa: [Adres]. Yarenler, yarenler.org alan adında sunulan bağımsız bir akademik keşif platformudur. Bu protokoldeki proje sahibi sıfatı, Ankara Yıldırım Beyazıt Üniversitesini temsil etme yetkisi veya üniversite adına sözleşme kurulması anlamına gelmez. Bundan sonra “Proje Sahibi” olarak anılır.</w:t>
       </w:r>
     </w:p>
     <w:p>
@@ -577,7 +577,7 @@
         <w:widowControl/>
       </w:pPr>
       <w:r>
-        <w:t>Yarenler Proje Sahibi: Örnek temsilci</w:t>
+        <w:t>Yarenler Proje Sahibi: Tarık İsmet Alkan</w:t>
       </w:r>
     </w:p>
     <w:p>

</xml_diff>